<commit_message>
Fix 5 live bugs: account links, delete title, scraper domain filter, title limit, CV keywords
- services/account_links.py: fully implement get_links() and set_link() (was NotImplementedError)
- api/app.py: fix api_delete_title to use PK (id) not FK (title_id); add account-links endpoints;
  enforce 10-title limit on synonym expansion in bg()
- services/scraper.py: remove TRUSTED_DOMAINS hard filter that blocked all non-whitelisted jobs,
  returning 0 results for every new title added
- prompts.py: add STEP 1 keyword extraction block to tailored_cv_prompt so CV bullets get
  job-description keywords injected based on candidate's actual experience
- services/cv_generator.py: raise CV_MAX_TOKENS 2800→3200 to prevent truncation
- lovable_prompt.txt/docx: update with account-links API spec and corrected delete-title field name

https://claude.ai/code/session_01CTEpSeKm9L8pkv7akdSCLw
</commit_message>
<xml_diff>
--- a/lovable_prompt.docx
+++ b/lovable_prompt.docx
@@ -1129,7 +1129,7 @@
         <w:rPr>
           <w:sz w:val="20"/>
         </w:rPr>
-        <w:t xml:space="preserve">  Body:    { "user_id": string, "title_id": string }  ← use user_title_id here</w:t>
+        <w:t xml:space="preserve">  Body:    { "user_id": string, "user_title_id": string }</w:t>
       </w:r>
     </w:p>
     <w:p>
@@ -1151,6 +1151,17 @@
         <w:rPr>
           <w:sz w:val="20"/>
         </w:rPr>
+        <w:t xml:space="preserve">  Note:    Pass the user_title_id field from /api/get-titles response (NOT title_id)</w:t>
+      </w:r>
+    </w:p>
+    <w:p>
+      <w:pPr>
+        <w:spacing w:after="0"/>
+      </w:pPr>
+      <w:r>
+        <w:rPr>
+          <w:sz w:val="20"/>
+        </w:rPr>
       </w:r>
     </w:p>
     <w:p>
@@ -1932,6 +1943,193 @@
           <w:sz w:val="20"/>
         </w:rPr>
         <w:t xml:space="preserve">  Display: Dedicated "Skills Gap" card in Settings or Dashboard header.</w:t>
+      </w:r>
+    </w:p>
+    <w:p>
+      <w:pPr>
+        <w:spacing w:after="0"/>
+      </w:pPr>
+      <w:r>
+        <w:rPr>
+          <w:sz w:val="20"/>
+        </w:rPr>
+      </w:r>
+    </w:p>
+    <w:p>
+      <w:pPr>
+        <w:spacing w:after="0"/>
+      </w:pPr>
+      <w:r>
+        <w:rPr>
+          <w:b/>
+          <w:sz w:val="20"/>
+        </w:rPr>
+        <w:t>── ACCOUNT LINKS (profile page) ─────────────────────────────────────────────</w:t>
+      </w:r>
+    </w:p>
+    <w:p>
+      <w:pPr>
+        <w:spacing w:after="0"/>
+      </w:pPr>
+      <w:r>
+        <w:rPr>
+          <w:sz w:val="20"/>
+        </w:rPr>
+      </w:r>
+    </w:p>
+    <w:p>
+      <w:pPr>
+        <w:spacing w:after="0"/>
+      </w:pPr>
+      <w:r>
+        <w:rPr>
+          <w:b/>
+          <w:sz w:val="20"/>
+        </w:rPr>
+        <w:t>POST /api/account-links</w:t>
+      </w:r>
+    </w:p>
+    <w:p>
+      <w:pPr>
+        <w:spacing w:after="0"/>
+      </w:pPr>
+      <w:r>
+        <w:rPr>
+          <w:sz w:val="20"/>
+        </w:rPr>
+        <w:t xml:space="preserve">  Body:    { "user_id": string }</w:t>
+      </w:r>
+    </w:p>
+    <w:p>
+      <w:pPr>
+        <w:spacing w:after="0"/>
+      </w:pPr>
+      <w:r>
+        <w:rPr>
+          <w:sz w:val="20"/>
+        </w:rPr>
+        <w:t xml:space="preserve">  Returns: { "links": [{ "site": "linkedin|indeed|bayt|naukrigulf|gulftalent",</w:t>
+      </w:r>
+    </w:p>
+    <w:p>
+      <w:pPr>
+        <w:spacing w:after="0"/>
+      </w:pPr>
+      <w:r>
+        <w:rPr>
+          <w:sz w:val="20"/>
+        </w:rPr>
+        <w:t xml:space="preserve">                          "status": "linked|unlinked|expired",</w:t>
+      </w:r>
+    </w:p>
+    <w:p>
+      <w:pPr>
+        <w:spacing w:after="0"/>
+      </w:pPr>
+      <w:r>
+        <w:rPr>
+          <w:sz w:val="20"/>
+        </w:rPr>
+        <w:t xml:space="preserve">                          "linked_at": string|null }] }</w:t>
+      </w:r>
+    </w:p>
+    <w:p>
+      <w:pPr>
+        <w:spacing w:after="0"/>
+      </w:pPr>
+      <w:r>
+        <w:rPr>
+          <w:sz w:val="20"/>
+        </w:rPr>
+        <w:t xml:space="preserve">  Display: 5 platform cards in profile/settings. Green check = linked, grey = unlinked.</w:t>
+      </w:r>
+    </w:p>
+    <w:p>
+      <w:pPr>
+        <w:spacing w:after="0"/>
+      </w:pPr>
+      <w:r>
+        <w:rPr>
+          <w:sz w:val="20"/>
+        </w:rPr>
+      </w:r>
+    </w:p>
+    <w:p>
+      <w:pPr>
+        <w:spacing w:after="0"/>
+      </w:pPr>
+      <w:r>
+        <w:rPr>
+          <w:b/>
+          <w:sz w:val="20"/>
+        </w:rPr>
+        <w:t>POST /api/set-account-link</w:t>
+      </w:r>
+    </w:p>
+    <w:p>
+      <w:pPr>
+        <w:spacing w:after="0"/>
+      </w:pPr>
+      <w:r>
+        <w:rPr>
+          <w:sz w:val="20"/>
+        </w:rPr>
+        <w:t xml:space="preserve">  Body:    { "user_id": string, "site": string, "status": "linked|unlinked" }</w:t>
+      </w:r>
+    </w:p>
+    <w:p>
+      <w:pPr>
+        <w:spacing w:after="0"/>
+      </w:pPr>
+      <w:r>
+        <w:rPr>
+          <w:sz w:val="20"/>
+        </w:rPr>
+        <w:t xml:space="preserve">  Returns: { "ok": true }</w:t>
+      </w:r>
+    </w:p>
+    <w:p>
+      <w:pPr>
+        <w:spacing w:after="0"/>
+      </w:pPr>
+      <w:r>
+        <w:rPr>
+          <w:sz w:val="20"/>
+        </w:rPr>
+        <w:t xml:space="preserve">  Use:     Toggle button on each platform card to mark as linked/unlinked.</w:t>
+      </w:r>
+    </w:p>
+    <w:p>
+      <w:pPr>
+        <w:spacing w:after="0"/>
+      </w:pPr>
+      <w:r>
+        <w:rPr>
+          <w:sz w:val="20"/>
+        </w:rPr>
+        <w:t xml:space="preserve">  Note:    This records the user's self-reported account status only. Auto-apply</w:t>
+      </w:r>
+    </w:p>
+    <w:p>
+      <w:pPr>
+        <w:spacing w:after="0"/>
+      </w:pPr>
+      <w:r>
+        <w:rPr>
+          <w:sz w:val="20"/>
+        </w:rPr>
+        <w:t xml:space="preserve">           via API is not available on UAE job boards. Users apply manually through</w:t>
+      </w:r>
+    </w:p>
+    <w:p>
+      <w:pPr>
+        <w:spacing w:after="0"/>
+      </w:pPr>
+      <w:r>
+        <w:rPr>
+          <w:sz w:val="20"/>
+        </w:rPr>
+        <w:t xml:space="preserve">           the linked platform using their stored credentials.</w:t>
       </w:r>
     </w:p>
     <w:p>

</xml_diff>